<commit_message>
Dossier v3 : alignement sur le certificat Qualiopi, la base Airtable et la charte YEBA
- Coordonnées, assurance Hiscox, TVA (art. 293 B), mention EI, Qualiopi
  4 catégories valable jusqu'au 16/02/2029 et audit de surveillance planifié.
- Charte YEBA-IDENT-2026 : texte bleu ou noir, or réservé aux filets,
  interligne 1,3, bloc-marque et mention de transparence IA sur chaque document.
- Documents stagiaires recentrés sur les parcours certifiants en complément
  du socle officiel (avenant RI-06, conditions particulières CP-05,
  aménagements d'examen) ; doublons retirés ; règle cyclonique alignée.
- SOC-04 : socle documentaire et écarts relevés dans Airtable ; plan
  d'actions complété (médiateur, attestation 3511-SD, assurance IA, audit).
- Instantané des documents officiels Airtable dans sources/.

Co-Authored-By: Claude Opus 5.5 <noreply@anthropic.com>
Claude-Session: https://claude.ai/code/session_01JZ6CWNerPeDJEuR1MPsUp5
</commit_message>
<xml_diff>
--- a/dossier-conformite-2026/livrables/00_NOTE_DE_SYNTHESE.docx
+++ b/dossier-conformite-2026/livrables/00_NOTE_DE_SYNTHESE.docx
@@ -63,16 +63,16 @@
       <w:r>
         <w:rPr>
           <w:b/>
-          <w:color w:val="8A6D1F"/>
+          <w:color w:val="1B3A6B"/>
           <w:sz w:val="32"/>
         </w:rPr>
-        <w:t>Votre année de formation continue avec les titres MEM et RPMS — version 2</w:t>
+        <w:t>Votre année de formation continue avec les titres MEM et RPMS — version 3</w:t>
       </w:r>
     </w:p>
     <w:p>
       <w:pPr>
         <w:pBdr>
-          <w:bottom w:val="single" w:sz="18" w:space="1" w:color="C9A94D"/>
+          <w:bottom w:val="single" w:sz="18" w:space="1" w:color="C9A84C"/>
         </w:pBdr>
       </w:pPr>
     </w:p>
@@ -136,7 +136,7 @@
         <w:rPr>
           <w:b w:val="0"/>
         </w:rPr>
-        <w:t xml:space="preserve"> : envoyer la version A (suspension de l'extension à l'apprentissage) </w:t>
+        <w:t xml:space="preserve"> : envoyer la version A </w:t>
       </w:r>
       <w:r>
         <w:rPr>
@@ -148,7 +148,7 @@
         <w:rPr>
           <w:b w:val="0"/>
         </w:rPr>
-        <w:t>. Le courriel est daté du 20 octobre ; le 12e jour tombe le dimanche 1er novembre (Toussaint).</w:t>
+        <w:t xml:space="preserve"> (courriel du 20 octobre ; le 12e jour tombe le dimanche 1er novembre).</w:t>
       </w:r>
     </w:p>
     <w:p>
@@ -220,7 +220,7 @@
         <w:rPr>
           <w:b w:val="0"/>
         </w:rPr>
-        <w:t xml:space="preserve"> : passer par un centre déjà agréé pour la 1re session MEM, puis demander votre propre agrément.</w:t>
+        <w:t xml:space="preserve"> : centre agréé partenaire pour la 1re session MEM, puis agrément propre.</w:t>
       </w:r>
     </w:p>
     <w:p>
@@ -238,13 +238,13 @@
         <w:rPr>
           <w:b/>
         </w:rPr>
-        <w:t>Avant tout envoi</w:t>
+        <w:t>Trois urgences avant d'encaisser</w:t>
       </w:r>
       <w:r>
         <w:rPr>
           <w:b w:val="0"/>
         </w:rPr>
-        <w:t xml:space="preserve"> : compléter les champs en or foncé et vérifier les mentions « À VÉRIFIER ».</w:t>
+        <w:t xml:space="preserve"> : désigner un médiateur de la consommation ; régler la question de la TVA avec l'expert-comptable ; faire confirmer par le courtier la couverture des activités liées à l'IA.</w:t>
       </w:r>
     </w:p>
     <w:p>
@@ -252,7 +252,309 @@
         <w:pStyle w:val="Heading1"/>
       </w:pPr>
       <w:r>
-        <w:t>2. Ce qui a changé depuis la version 1</w:t>
+        <w:t>2. Ce que révèlent le certificat Qualiopi et votre base Airtable</w:t>
+      </w:r>
+    </w:p>
+    <w:tbl>
+      <w:tblPr>
+        <w:tblStyle w:val="TableGrid"/>
+        <w:tblW w:type="auto" w:w="0"/>
+        <w:jc w:val="center"/>
+        <w:tblLayout w:type="fixed"/>
+        <w:tblLook w:firstColumn="1" w:firstRow="1" w:lastColumn="0" w:lastRow="0" w:noHBand="0" w:noVBand="1" w:val="04A0"/>
+      </w:tblPr>
+      <w:tblGrid>
+        <w:gridCol w:w="3969"/>
+        <w:gridCol w:w="5670"/>
+      </w:tblGrid>
+      <w:tr>
+        <w:trPr>
+          <w:tblHeader w:val="true"/>
+        </w:trPr>
+        <w:tc>
+          <w:tcPr>
+            <w:tcW w:type="dxa" w:w="3969"/>
+            <w:shd w:val="clear" w:color="auto" w:fill="1B3A6B"/>
+          </w:tcPr>
+          <w:p>
+            <w:r/>
+            <w:r>
+              <w:rPr>
+                <w:b/>
+                <w:color w:val="FFFFFF"/>
+                <w:sz w:val="22"/>
+              </w:rPr>
+              <w:t>Constat</w:t>
+            </w:r>
+          </w:p>
+        </w:tc>
+        <w:tc>
+          <w:tcPr>
+            <w:tcW w:type="dxa" w:w="5669"/>
+            <w:shd w:val="clear" w:color="auto" w:fill="1B3A6B"/>
+          </w:tcPr>
+          <w:p>
+            <w:r/>
+            <w:r>
+              <w:rPr>
+                <w:b/>
+                <w:color w:val="FFFFFF"/>
+                <w:sz w:val="22"/>
+              </w:rPr>
+              <w:t>Conséquence</w:t>
+            </w:r>
+          </w:p>
+        </w:tc>
+      </w:tr>
+      <w:tr>
+        <w:trPr>
+          <w:cantSplit w:val="true"/>
+        </w:trPr>
+        <w:tc>
+          <w:tcPr>
+            <w:tcW w:type="dxa" w:w="3969"/>
+          </w:tcPr>
+          <w:p>
+            <w:r/>
+            <w:r>
+              <w:rPr>
+                <w:b w:val="0"/>
+                <w:sz w:val="22"/>
+              </w:rPr>
+              <w:t>Le certificat 25FOR02027.1 couvre les 4 catégories, dont l'apprentissage</w:t>
+            </w:r>
+          </w:p>
+        </w:tc>
+        <w:tc>
+          <w:tcPr>
+            <w:tcW w:type="dxa" w:w="5669"/>
+          </w:tcPr>
+          <w:p>
+            <w:r/>
+            <w:r>
+              <w:rPr>
+                <w:b w:val="0"/>
+                <w:sz w:val="22"/>
+              </w:rPr>
+              <w:t>L'extension Qualiopi n'est pas nécessaire si vous ouvrez un jour l'apprentissage ; les courriels à la DEETS sont mis à jour</w:t>
+            </w:r>
+          </w:p>
+        </w:tc>
+      </w:tr>
+      <w:tr>
+        <w:trPr>
+          <w:cantSplit w:val="true"/>
+        </w:trPr>
+        <w:tc>
+          <w:tcPr>
+            <w:tcW w:type="dxa" w:w="3969"/>
+            <w:shd w:val="clear" w:color="auto" w:fill="E8EEF7"/>
+          </w:tcPr>
+          <w:p>
+            <w:r/>
+            <w:r>
+              <w:rPr>
+                <w:b w:val="0"/>
+                <w:sz w:val="22"/>
+              </w:rPr>
+              <w:t>Validité du 17/02/2026 au 16/02/2029 (Airtable indique 2027)</w:t>
+            </w:r>
+          </w:p>
+        </w:tc>
+        <w:tc>
+          <w:tcPr>
+            <w:tcW w:type="dxa" w:w="5669"/>
+            <w:shd w:val="clear" w:color="auto" w:fill="E8EEF7"/>
+          </w:tcPr>
+          <w:p>
+            <w:r/>
+            <w:r>
+              <w:rPr>
+                <w:b w:val="0"/>
+                <w:sz w:val="22"/>
+              </w:rPr>
+              <w:t>Audit de surveillance entre le 17/04/2027 et le 17/12/2027 : il tombera pendant la promotion MEM, préparez les preuves dès mars 2027</w:t>
+            </w:r>
+          </w:p>
+        </w:tc>
+      </w:tr>
+      <w:tr>
+        <w:trPr>
+          <w:cantSplit w:val="true"/>
+        </w:trPr>
+        <w:tc>
+          <w:tcPr>
+            <w:tcW w:type="dxa" w:w="3969"/>
+          </w:tcPr>
+          <w:p>
+            <w:r/>
+            <w:r>
+              <w:rPr>
+                <w:b w:val="0"/>
+                <w:sz w:val="22"/>
+              </w:rPr>
+              <w:t>Site certifié : le siège, 9 rue Françoise Châtelain</w:t>
+            </w:r>
+          </w:p>
+        </w:tc>
+        <w:tc>
+          <w:tcPr>
+            <w:tcW w:type="dxa" w:w="5669"/>
+          </w:tcPr>
+          <w:p>
+            <w:r/>
+            <w:r>
+              <w:rPr>
+                <w:b w:val="0"/>
+                <w:sz w:val="22"/>
+              </w:rPr>
+              <w:t>Le Secrétariat Center est une salle louée : fiche site tiers YEBA-DOC-15 à remplir</w:t>
+            </w:r>
+          </w:p>
+        </w:tc>
+      </w:tr>
+      <w:tr>
+        <w:trPr>
+          <w:cantSplit w:val="true"/>
+        </w:trPr>
+        <w:tc>
+          <w:tcPr>
+            <w:tcW w:type="dxa" w:w="3969"/>
+            <w:shd w:val="clear" w:color="auto" w:fill="E8EEF7"/>
+          </w:tcPr>
+          <w:p>
+            <w:r/>
+            <w:r>
+              <w:rPr>
+                <w:b w:val="0"/>
+                <w:sz w:val="22"/>
+              </w:rPr>
+              <w:t>Charte graphique YEBA-IDENT-2026</w:t>
+            </w:r>
+          </w:p>
+        </w:tc>
+        <w:tc>
+          <w:tcPr>
+            <w:tcW w:type="dxa" w:w="5669"/>
+            <w:shd w:val="clear" w:color="auto" w:fill="E8EEF7"/>
+          </w:tcPr>
+          <w:p>
+            <w:r/>
+            <w:r>
+              <w:rPr>
+                <w:b w:val="0"/>
+                <w:sz w:val="22"/>
+              </w:rPr>
+              <w:t>Appliquée : texte bleu ou noir, or réservé aux filets, interligne 1,3, bloc-marque et mention de transparence IA sur chaque document</w:t>
+            </w:r>
+          </w:p>
+        </w:tc>
+      </w:tr>
+      <w:tr>
+        <w:trPr>
+          <w:cantSplit w:val="true"/>
+        </w:trPr>
+        <w:tc>
+          <w:tcPr>
+            <w:tcW w:type="dxa" w:w="3969"/>
+          </w:tcPr>
+          <w:p>
+            <w:r/>
+            <w:r>
+              <w:rPr>
+                <w:b w:val="0"/>
+                <w:sz w:val="22"/>
+              </w:rPr>
+              <w:t>Documents officiels déjà en vigueur (règlement intérieur, CGV, politiques)</w:t>
+            </w:r>
+          </w:p>
+        </w:tc>
+        <w:tc>
+          <w:tcPr>
+            <w:tcW w:type="dxa" w:w="5669"/>
+          </w:tcPr>
+          <w:p>
+            <w:r/>
+            <w:r>
+              <w:rPr>
+                <w:b w:val="0"/>
+                <w:sz w:val="22"/>
+              </w:rPr>
+              <w:t>Les documents du dossier les complètent sans les dupliquer (avenant RI-06, conditions particulières CP-05…)</w:t>
+            </w:r>
+          </w:p>
+        </w:tc>
+      </w:tr>
+      <w:tr>
+        <w:trPr>
+          <w:cantSplit w:val="true"/>
+        </w:trPr>
+        <w:tc>
+          <w:tcPr>
+            <w:tcW w:type="dxa" w:w="3969"/>
+            <w:shd w:val="clear" w:color="auto" w:fill="E8EEF7"/>
+          </w:tcPr>
+          <w:p>
+            <w:r/>
+            <w:r>
+              <w:rPr>
+                <w:b w:val="0"/>
+                <w:sz w:val="22"/>
+              </w:rPr>
+              <w:t>Plusieurs incohérences dans les documents officiels</w:t>
+            </w:r>
+          </w:p>
+        </w:tc>
+        <w:tc>
+          <w:tcPr>
+            <w:tcW w:type="dxa" w:w="5669"/>
+            <w:shd w:val="clear" w:color="auto" w:fill="E8EEF7"/>
+          </w:tcPr>
+          <w:p>
+            <w:r/>
+            <w:r>
+              <w:rPr>
+                <w:b w:val="0"/>
+                <w:sz w:val="22"/>
+              </w:rPr>
+              <w:t>Liste et corrections proposées dans SOC-04</w:t>
+            </w:r>
+          </w:p>
+        </w:tc>
+      </w:tr>
+    </w:tbl>
+    <w:p/>
+    <w:p>
+      <w:pPr>
+        <w:pStyle w:val="Heading1"/>
+      </w:pPr>
+      <w:r>
+        <w:t>3. Le point fiscal à ne pas manquer</w:t>
+      </w:r>
+    </w:p>
+    <w:p>
+      <w:r>
+        <w:rPr>
+          <w:b w:val="0"/>
+        </w:rPr>
+        <w:t xml:space="preserve">YEBA FORMATIONS est en franchise en base de TVA (article 293 B du CGI). Une seule promotion de titre professionnel peut faire dépasser le seuil de franchise sur l'année. En cas de dépassement, la formation ne reste sans TVA qu'avec l'attestation 3511-SD (exonération de la formation professionnelle continue) ; le conseil serait soumis à la TVA à 8,5 %. Votre base Airtable recommande déjà de demander cette attestation : faites-le avant les premières recettes des parcours. </w:t>
+      </w:r>
+      <w:r>
+        <w:rPr>
+          <w:b/>
+          <w:i/>
+          <w:color w:val="1B3A6B"/>
+          <w:u w:val="single"/>
+        </w:rPr>
+        <w:t>[À VÉRIFIER avec l'expert-comptable : seuil applicable à La Réunion.]</w:t>
+      </w:r>
+    </w:p>
+    <w:p>
+      <w:pPr>
+        <w:pStyle w:val="Heading1"/>
+      </w:pPr>
+      <w:r>
+        <w:t>4. Ce qui a changé dans cette version</w:t>
       </w:r>
     </w:p>
     <w:tbl>
@@ -321,7 +623,7 @@
                 <w:b w:val="0"/>
                 <w:sz w:val="22"/>
               </w:rPr>
-              <w:t>Statut</w:t>
+              <w:t>Coordonnées</w:t>
             </w:r>
           </w:p>
         </w:tc>
@@ -336,7 +638,7 @@
                 <w:b w:val="0"/>
                 <w:sz w:val="22"/>
               </w:rPr>
-              <w:t>Entreprise individuelle : pas de statuts ; extrait RNE ou avis INSEE et attestation sur l'honneur (pièce 1 de la DEETS).</w:t>
+              <w:t>9 rue Françoise Châtelain, 97490 Sainte-Clotilde, La Réunion — 0693 32 24 45 — yebaformations@gmail.com — mention entrepreneur individuel (EI)</w:t>
             </w:r>
           </w:p>
         </w:tc>
@@ -357,7 +659,7 @@
                 <w:b w:val="0"/>
                 <w:sz w:val="22"/>
               </w:rPr>
-              <w:t>Horaires et lieu</w:t>
+              <w:t>Locaux</w:t>
             </w:r>
           </w:p>
         </w:tc>
@@ -373,7 +675,7 @@
                 <w:b w:val="0"/>
                 <w:sz w:val="22"/>
               </w:rPr>
-              <w:t>8 h 00 – 16 h 00, pauses 10 h 00 – 10 h 15 et 15 h 00 – 15 h 15, déjeuner 12 h – 13 h ; Secrétariat Center — 7 rue Henri Cornu — 97490 Saint-Denis ; location 100 € par jour.</w:t>
+              <w:t>Secrétariat Center : entrée accessible aux personnes à mobilité réduite, sanitaires, salle de pause, vidéoprojecteur et tableau</w:t>
             </w:r>
           </w:p>
         </w:tc>
@@ -393,7 +695,7 @@
                 <w:b w:val="0"/>
                 <w:sz w:val="22"/>
               </w:rPr>
-              <w:t>Référentiel MEM</w:t>
+              <w:t>Qualiopi</w:t>
             </w:r>
           </w:p>
         </w:tc>
@@ -408,7 +710,7 @@
                 <w:b w:val="0"/>
                 <w:sz w:val="22"/>
               </w:rPr>
-              <w:t>Décorticage ligne par ligne sur le REAC v09 et le référentiel d'évaluation v09 : 10 compétences, critères officiels, productions exigées.</w:t>
+              <w:t>4 catégories, validité 2029, audit de surveillance planifié</w:t>
             </w:r>
           </w:p>
         </w:tc>
@@ -429,7 +731,7 @@
                 <w:b w:val="0"/>
                 <w:sz w:val="22"/>
               </w:rPr>
-              <w:t>Référentiel RPMS</w:t>
+              <w:t>Assurance et TVA</w:t>
             </w:r>
           </w:p>
         </w:tc>
@@ -445,7 +747,7 @@
                 <w:b w:val="0"/>
                 <w:sz w:val="22"/>
               </w:rPr>
-              <w:t>Les documents transmis datent de 2016 (ancienne version) : le décorticage suit les 9 compétences officielles de la fiche RNCP38575.</w:t>
+              <w:t>Données Hiscox et mention « TVA non applicable — article 293 B du CGI » reportées partout</w:t>
             </w:r>
           </w:p>
         </w:tc>
@@ -465,7 +767,7 @@
                 <w:b w:val="0"/>
                 <w:sz w:val="22"/>
               </w:rPr>
-              <w:t>Déroulé</w:t>
+              <w:t>Alerte cyclonique</w:t>
             </w:r>
           </w:p>
         </w:tc>
@@ -480,7 +782,7 @@
                 <w:b w:val="0"/>
                 <w:sz w:val="22"/>
               </w:rPr>
-              <w:t>Jour par jour avec dates réelles : MEM 80 jours (560 h), RPMS 85 jours (595 h).</w:t>
+              <w:t>Règle alignée sur le règlement intérieur YEBA-DOC-04 : alerte orange = suspension immédiate et report sans frais</w:t>
             </w:r>
           </w:p>
         </w:tc>
@@ -501,7 +803,7 @@
                 <w:b w:val="0"/>
                 <w:sz w:val="22"/>
               </w:rPr>
-              <w:t>Livrets</w:t>
+              <w:t>Documents stagiaires</w:t>
             </w:r>
           </w:p>
         </w:tc>
@@ -517,7 +819,7 @@
                 <w:b w:val="0"/>
                 <w:sz w:val="22"/>
               </w:rPr>
-              <w:t>Un livret d'accueil par titre, avec le déroulé de l'année, les jalons, les épreuves et les productions.</w:t>
+              <w:t>Convention et contrat propres aux parcours, conditions particulières CP-05, avenant au règlement intérieur, aménagements d'examen ; les doublons des documents officiels sont retirés</w:t>
             </w:r>
           </w:p>
         </w:tc>
@@ -537,7 +839,7 @@
                 <w:b w:val="0"/>
                 <w:sz w:val="22"/>
               </w:rPr>
-              <w:t>Nouveaux outils</w:t>
+              <w:t>Nouveau</w:t>
             </w:r>
           </w:p>
         </w:tc>
@@ -552,79 +854,7 @@
                 <w:b w:val="0"/>
                 <w:sz w:val="22"/>
               </w:rPr>
-              <w:t>Guides de période en entreprise, plan d'actions daté, budget et trésorerie, matrice Qualiopi, présentation du centre, organisation de l'examen, convocation, fiche de liaison prescripteur, fiche santé-sécurité, contenu du dossier stagiaire.</w:t>
-            </w:r>
-          </w:p>
-        </w:tc>
-      </w:tr>
-      <w:tr>
-        <w:trPr>
-          <w:cantSplit w:val="true"/>
-        </w:trPr>
-        <w:tc>
-          <w:tcPr>
-            <w:tcW w:type="dxa" w:w="2268"/>
-            <w:shd w:val="clear" w:color="auto" w:fill="E8EEF7"/>
-          </w:tcPr>
-          <w:p>
-            <w:r/>
-            <w:r>
-              <w:rPr>
-                <w:b w:val="0"/>
-                <w:sz w:val="22"/>
-              </w:rPr>
-              <w:t>Retirés à votre demande</w:t>
-            </w:r>
-          </w:p>
-        </w:tc>
-        <w:tc>
-          <w:tcPr>
-            <w:tcW w:type="dxa" w:w="7370"/>
-            <w:shd w:val="clear" w:color="auto" w:fill="E8EEF7"/>
-          </w:tcPr>
-          <w:p>
-            <w:r/>
-            <w:r>
-              <w:rPr>
-                <w:b w:val="0"/>
-                <w:sz w:val="22"/>
-              </w:rPr>
-              <w:t>Grilles d'évaluation, questions de positionnement et notations (elles viendront avec les supports de cours).</w:t>
-            </w:r>
-          </w:p>
-        </w:tc>
-      </w:tr>
-      <w:tr>
-        <w:trPr>
-          <w:cantSplit w:val="true"/>
-        </w:trPr>
-        <w:tc>
-          <w:tcPr>
-            <w:tcW w:type="dxa" w:w="2268"/>
-          </w:tcPr>
-          <w:p>
-            <w:r/>
-            <w:r>
-              <w:rPr>
-                <w:b w:val="0"/>
-                <w:sz w:val="22"/>
-              </w:rPr>
-              <w:t>Charte graphique</w:t>
-            </w:r>
-          </w:p>
-        </w:tc>
-        <w:tc>
-          <w:tcPr>
-            <w:tcW w:type="dxa" w:w="7370"/>
-          </w:tcPr>
-          <w:p>
-            <w:r/>
-            <w:r>
-              <w:rPr>
-                <w:b w:val="0"/>
-                <w:sz w:val="22"/>
-              </w:rPr>
-              <w:t>Bleu marine et or du logo, aucune couleur parasite, couverture avec logo, contrôle automatique : aucun mot coupé dans les tableaux.</w:t>
+              <w:t>SOC-04 : articulation avec le socle officiel et écarts à corriger</w:t>
             </w:r>
           </w:p>
         </w:tc>
@@ -636,73 +866,15 @@
         <w:pStyle w:val="Heading1"/>
       </w:pPr>
       <w:r>
-        <w:t>3. Ce que nous apprend le REAC MEM v09</w:t>
+        <w:t>5. Budget de salle</w:t>
       </w:r>
     </w:p>
     <w:p>
-      <w:pPr>
-        <w:pStyle w:val="ListBullet"/>
-      </w:pPr>
       <w:r>
         <w:rPr>
           <w:b w:val="0"/>
         </w:rPr>
-        <w:t>Le MEM est un manager de proximité : les prévisions économiques relèvent désormais du niveau 6 (Responsable d'établissement marchand).</w:t>
-      </w:r>
-    </w:p>
-    <w:p>
-      <w:pPr>
-        <w:pStyle w:val="ListBullet"/>
-      </w:pPr>
-      <w:r>
-        <w:rPr>
-          <w:b w:val="0"/>
-        </w:rPr>
-        <w:t>Les évaluations passées en cours de formation sont prises en compte par le jury : elles doivent être tracées dès le premier module.</w:t>
-      </w:r>
-    </w:p>
-    <w:p>
-      <w:pPr>
-        <w:pStyle w:val="ListBullet"/>
-      </w:pPr>
-      <w:r>
-        <w:rPr>
-          <w:b w:val="0"/>
-        </w:rPr>
-        <w:t>Les productions d'examen (deux documents et deux diaporamas) se construisent à partir de la période en entreprise : d'où le guide GPE et le choix de deux périodes de 140 h.</w:t>
-      </w:r>
-    </w:p>
-    <w:p>
-      <w:pPr>
-        <w:pStyle w:val="ListBullet"/>
-      </w:pPr>
-      <w:r>
-        <w:rPr>
-          <w:b w:val="0"/>
-        </w:rPr>
-        <w:t>L'épreuve se fait sur poste informatique (étude de cas de 4 h) : prévoir des ordinateurs portables dès le module T2 (budget).</w:t>
-      </w:r>
-    </w:p>
-    <w:p>
-      <w:pPr>
-        <w:pStyle w:val="ListBullet"/>
-      </w:pPr>
-      <w:r>
-        <w:rPr>
-          <w:b w:val="0"/>
-        </w:rPr>
-        <w:t>Le marché est porteur : tension de 3,7 sur les postes de manager de proximité (REAC v09, début 2025).</w:t>
-      </w:r>
-    </w:p>
-    <w:p>
-      <w:pPr>
-        <w:pStyle w:val="ListBullet"/>
-      </w:pPr>
-      <w:r>
-        <w:rPr>
-          <w:b w:val="0"/>
-        </w:rPr>
-        <w:t>Un concurrent réunionnais (ICCI Formations) diffuse déjà le REAC MEM v09 : différenciez-vous par l'IA, l'accompagnement individuel et l'accessibilité.</w:t>
+        <w:t>Secrétariat Center : MEM 8 000 € ; RPMS 8 500 € (hors informations collectives  jury blanc et examen). Durées : MEM 80 jours (560 h), RPMS 85 jours (595 h). Le classeur PIL-03 calcule le seuil de rentabilité et la trésorerie dès que vous saisissez votre prix et vos effectifs.</w:t>
       </w:r>
     </w:p>
     <w:p>
@@ -710,31 +882,7 @@
         <w:pStyle w:val="Heading1"/>
       </w:pPr>
       <w:r>
-        <w:t>4. Votre budget de salle</w:t>
-      </w:r>
-    </w:p>
-    <w:p>
-      <w:r>
-        <w:rPr>
-          <w:b w:val="0"/>
-        </w:rPr>
-        <w:t>Location au Secrétariat Center : MEM 8 000 € ; RPMS 8 500 € (hors informations collectives  jury blanc et examen). Le classeur PIL-03 calcule le seuil de rentabilité et la trésorerie mois par mois dès que vous saisissez votre prix et vos effectifs.</w:t>
-      </w:r>
-    </w:p>
-    <w:p>
-      <w:r>
-        <w:rPr>
-          <w:b w:val="0"/>
-        </w:rPr>
-        <w:t>Point d'attention : une location à la journée suffit pour la formation continue, mais elle serait fragile pour un CFA (accueil permanent) ou un agrément de centre d'examen (le site doit être stable).</w:t>
-      </w:r>
-    </w:p>
-    <w:p>
-      <w:pPr>
-        <w:pStyle w:val="Heading1"/>
-      </w:pPr>
-      <w:r>
-        <w:t>5. Autocritique et corrections</w:t>
+        <w:t>6. Autocritique</w:t>
       </w:r>
     </w:p>
     <w:tbl>
@@ -836,7 +984,7 @@
                 <w:b w:val="0"/>
                 <w:sz w:val="22"/>
               </w:rPr>
-              <w:t>RPMS bâti sans le REAC v08 officiel</w:t>
+              <w:t>RPMS bâti sans le REAC et le référentiel d'évaluation v08</w:t>
             </w:r>
           </w:p>
         </w:tc>
@@ -851,7 +999,7 @@
                 <w:b w:val="0"/>
                 <w:sz w:val="22"/>
               </w:rPr>
-              <w:t>Signalé dans chaque document RPMS ; à confronter dès réception du REAC v08</w:t>
+              <w:t>Signalé dans chaque document RPMS ; à confronter dès réception</w:t>
             </w:r>
           </w:p>
         </w:tc>
@@ -888,7 +1036,7 @@
                 <w:b w:val="0"/>
                 <w:sz w:val="22"/>
               </w:rPr>
-              <w:t>Indicateurs Qualiopi en libellés abrégés</w:t>
+              <w:t>Documents officiels encore incomplets (CGV, convention, réclamations)</w:t>
             </w:r>
           </w:p>
         </w:tc>
@@ -904,7 +1052,7 @@
                 <w:b w:val="0"/>
                 <w:sz w:val="22"/>
               </w:rPr>
-              <w:t>Renvoi au référentiel national qualité pour la formulation exacte</w:t>
+              <w:t>Écarts listés dans SOC-04 ; aucun contrat particulier sans médiateur</w:t>
             </w:r>
           </w:p>
         </w:tc>
@@ -924,7 +1072,7 @@
                 <w:b w:val="0"/>
                 <w:sz w:val="22"/>
               </w:rPr>
-              <w:t>Faisabilité</w:t>
+              <w:t>Économique</w:t>
             </w:r>
           </w:p>
         </w:tc>
@@ -939,7 +1087,7 @@
                 <w:b w:val="0"/>
                 <w:sz w:val="22"/>
               </w:rPr>
-              <w:t>Périodes en entreprise qui commencent en milieu de semaine</w:t>
+              <w:t>Risque de sortie de franchise de TVA</w:t>
             </w:r>
           </w:p>
         </w:tc>
@@ -954,7 +1102,7 @@
                 <w:b w:val="0"/>
                 <w:sz w:val="22"/>
               </w:rPr>
-              <w:t>Acceptable pour les entreprises ; ajustable en décalant la date de démarrage</w:t>
+              <w:t>Action datée dans le plan PIL-01 ; avertissement dans le budget</w:t>
             </w:r>
           </w:p>
         </w:tc>
@@ -991,7 +1139,7 @@
                 <w:b w:val="0"/>
                 <w:sz w:val="22"/>
               </w:rPr>
-              <w:t>RPMS en décembre–février, pleine saison cyclonique</w:t>
+              <w:t>Audit Qualiopi pendant la 1re promotion</w:t>
             </w:r>
           </w:p>
         </w:tc>
@@ -1007,7 +1155,7 @@
                 <w:b w:val="0"/>
                 <w:sz w:val="22"/>
               </w:rPr>
-              <w:t>Plan de continuité et formation à distance prévus ; décaler à août si vous préférez</w:t>
+              <w:t>Préparation dès mars 2027 avec la matrice QUA-02</w:t>
             </w:r>
           </w:p>
         </w:tc>
@@ -1027,7 +1175,7 @@
                 <w:b w:val="0"/>
                 <w:sz w:val="22"/>
               </w:rPr>
-              <w:t>Économique</w:t>
+              <w:t>Souveraineté</w:t>
             </w:r>
           </w:p>
         </w:tc>
@@ -1042,7 +1190,7 @@
                 <w:b w:val="0"/>
                 <w:sz w:val="22"/>
               </w:rPr>
-              <w:t>Prix de vente inconnu</w:t>
+              <w:t>Airtable et Gmail hébergés hors UE</w:t>
             </w:r>
           </w:p>
         </w:tc>
@@ -1057,7 +1205,7 @@
                 <w:b w:val="0"/>
                 <w:sz w:val="22"/>
               </w:rPr>
-              <w:t>Budget paramétrable ; aucun chiffre inventé</w:t>
+              <w:t>Migration déjà décidée (Baserow chez OVHcloud, Brevo) ; numéro de sécurité sociale et RIB hors Airtable</w:t>
             </w:r>
           </w:p>
         </w:tc>
@@ -1078,7 +1226,7 @@
                 <w:b w:val="0"/>
                 <w:sz w:val="22"/>
               </w:rPr>
-              <w:t>Social</w:t>
+              <w:t>Identité</w:t>
             </w:r>
           </w:p>
         </w:tc>
@@ -1094,7 +1242,7 @@
                 <w:b w:val="0"/>
                 <w:sz w:val="22"/>
               </w:rPr>
-              <w:t>Public Missions Locales sur un parcours de 6 mois</w:t>
+              <w:t>Deux logos possibles (PNG transmis, SVG de la charte)</w:t>
             </w:r>
           </w:p>
         </w:tc>
@@ -1110,7 +1258,7 @@
                 <w:b w:val="0"/>
                 <w:sz w:val="22"/>
               </w:rPr>
-              <w:t>Alternance courte, bilan de mi-parcours, fiche de liaison, réaction le jour même</w:t>
+              <w:t>PNG utilisé ; à confirmer</w:t>
             </w:r>
           </w:p>
         </w:tc>
@@ -1145,7 +1293,7 @@
                 <w:b w:val="0"/>
                 <w:sz w:val="22"/>
               </w:rPr>
-              <w:t>Données des stagiaires dans des documents remplis</w:t>
+              <w:t>Dossiers remplis contenant des données personnelles</w:t>
             </w:r>
           </w:p>
         </w:tc>
@@ -1160,110 +1308,7 @@
                 <w:b w:val="0"/>
                 <w:sz w:val="22"/>
               </w:rPr>
-              <w:t>Ne jamais les committer : dossier « dossiers-remplis » exclu de Git, stockage UE chiffré</w:t>
-            </w:r>
-          </w:p>
-        </w:tc>
-      </w:tr>
-      <w:tr>
-        <w:trPr>
-          <w:cantSplit w:val="true"/>
-        </w:trPr>
-        <w:tc>
-          <w:tcPr>
-            <w:tcW w:type="dxa" w:w="1701"/>
-            <w:shd w:val="clear" w:color="auto" w:fill="E8EEF7"/>
-          </w:tcPr>
-          <w:p>
-            <w:r/>
-            <w:r>
-              <w:rPr>
-                <w:b w:val="0"/>
-                <w:sz w:val="22"/>
-              </w:rPr>
-              <w:t>Écologique</w:t>
-            </w:r>
-          </w:p>
-        </w:tc>
-        <w:tc>
-          <w:tcPr>
-            <w:tcW w:type="dxa" w:w="3685"/>
-            <w:shd w:val="clear" w:color="auto" w:fill="E8EEF7"/>
-          </w:tcPr>
-          <w:p>
-            <w:r/>
-            <w:r>
-              <w:rPr>
-                <w:b w:val="0"/>
-                <w:sz w:val="22"/>
-              </w:rPr>
-              <w:t>Impression des dossiers</w:t>
-            </w:r>
-          </w:p>
-        </w:tc>
-        <w:tc>
-          <w:tcPr>
-            <w:tcW w:type="dxa" w:w="4252"/>
-            <w:shd w:val="clear" w:color="auto" w:fill="E8EEF7"/>
-          </w:tcPr>
-          <w:p>
-            <w:r/>
-            <w:r>
-              <w:rPr>
-                <w:b w:val="0"/>
-                <w:sz w:val="22"/>
-              </w:rPr>
-              <w:t>Dématérialisation, sauf travaux d'examen à imprimer selon le référentiel</w:t>
-            </w:r>
-          </w:p>
-        </w:tc>
-      </w:tr>
-      <w:tr>
-        <w:trPr>
-          <w:cantSplit w:val="true"/>
-        </w:trPr>
-        <w:tc>
-          <w:tcPr>
-            <w:tcW w:type="dxa" w:w="1701"/>
-          </w:tcPr>
-          <w:p>
-            <w:r/>
-            <w:r>
-              <w:rPr>
-                <w:b w:val="0"/>
-                <w:sz w:val="22"/>
-              </w:rPr>
-              <w:t>Politique</w:t>
-            </w:r>
-          </w:p>
-        </w:tc>
-        <w:tc>
-          <w:tcPr>
-            <w:tcW w:type="dxa" w:w="3685"/>
-          </w:tcPr>
-          <w:p>
-            <w:r/>
-            <w:r>
-              <w:rPr>
-                <w:b w:val="0"/>
-                <w:sz w:val="22"/>
-              </w:rPr>
-              <w:t>Dépendance aux appels d'offres régionaux</w:t>
-            </w:r>
-          </w:p>
-        </w:tc>
-        <w:tc>
-          <w:tcPr>
-            <w:tcW w:type="dxa" w:w="4252"/>
-          </w:tcPr>
-          <w:p>
-            <w:r/>
-            <w:r>
-              <w:rPr>
-                <w:b w:val="0"/>
-                <w:sz w:val="22"/>
-              </w:rPr>
-              <w:t>Mix CPF, France Travail, OPCO et formations courtes en intra</w:t>
+              <w:t>Jamais dans Git ; espace chiffré hébergé dans l'UE</w:t>
             </w:r>
           </w:p>
         </w:tc>
@@ -1275,7 +1320,7 @@
         <w:pStyle w:val="Heading1"/>
       </w:pPr>
       <w:r>
-        <w:t>6. Ce qu'il me manque</w:t>
+        <w:t>7. Ce qu'il me manque encore</w:t>
       </w:r>
     </w:p>
     <w:p>
@@ -1293,7 +1338,7 @@
         <w:rPr>
           <w:b w:val="0"/>
         </w:rPr>
-        <w:t>Le certificat Qualiopi : la pièce jointe annoncée n'est pas arrivée (seuls les référentiels ont été reçus). J'en ai besoin pour le périmètre et la date d'audit.</w:t>
+        <w:t>Le REAC et le référentiel d'évaluation RPMS millésime 08 (2023).</w:t>
       </w:r>
     </w:p>
     <w:p>
@@ -1311,7 +1356,7 @@
         <w:rPr>
           <w:b w:val="0"/>
         </w:rPr>
-        <w:t>Le REAC et le référentiel d'évaluation RPMS millésime 08 (2023).</w:t>
+        <w:t>Le prix de vente par titre et par CCP, et l'effectif cible par promotion.</w:t>
       </w:r>
     </w:p>
     <w:p>
@@ -1329,7 +1374,7 @@
         <w:rPr>
           <w:b w:val="0"/>
         </w:rPr>
-        <w:t>Téléphone, e-mail, site, adresse du siège (si différente du Secrétariat Center).</w:t>
+        <w:t>Le logo officiel : le PNG transmis ou le fichier « logo-yeba-sans-oeil.svg » de votre charte ?</w:t>
       </w:r>
     </w:p>
     <w:p>
@@ -1347,7 +1392,7 @@
         <w:rPr>
           <w:b w:val="0"/>
         </w:rPr>
-        <w:t>Accessibilité du Secrétariat Center (PMR, sanitaires, salle de pause) et équipement (vidéoprojecteur, connexion).</w:t>
+        <w:t>Les accès au Secrétariat Center (lignes de bus, stationnement).</w:t>
       </w:r>
     </w:p>
     <w:p>
@@ -1365,43 +1410,7 @@
         <w:rPr>
           <w:b w:val="0"/>
         </w:rPr>
-        <w:t>Prix de vente par titre et par CCP, effectif cible.</w:t>
-      </w:r>
-    </w:p>
-    <w:p>
-      <w:pPr>
-        <w:ind w:left="454" w:hanging="454"/>
-      </w:pPr>
-      <w:r>
-        <w:rPr>
-          <w:b/>
-          <w:color w:val="1B3A6B"/>
-        </w:rPr>
-        <w:t xml:space="preserve">6.  </w:t>
-      </w:r>
-      <w:r>
-        <w:rPr>
-          <w:b w:val="0"/>
-        </w:rPr>
-        <w:t>Les dates de démarrage proposées vous conviennent-elles (MEM le 1er mars 2027, RPMS le 6 septembre 2027) ?</w:t>
-      </w:r>
-    </w:p>
-    <w:p>
-      <w:pPr>
-        <w:ind w:left="454" w:hanging="454"/>
-      </w:pPr>
-      <w:r>
-        <w:rPr>
-          <w:b/>
-          <w:color w:val="1B3A6B"/>
-        </w:rPr>
-        <w:t xml:space="preserve">7.  </w:t>
-      </w:r>
-      <w:r>
-        <w:rPr>
-          <w:b w:val="0"/>
-        </w:rPr>
-        <w:t>Les livrets réalisés pour Marilyn Institut : je n'ai pas accès à cette conversation. Si vous me les transmettez, j'aligne la présentation (sans jamais mêler les deux marques).</w:t>
+        <w:t>Les livrets réalisés pour un autre organisme, quand vous voudrez (sans mêler les deux marques).</w:t>
       </w:r>
     </w:p>
     <w:p>
@@ -1409,7 +1418,7 @@
         <w:pStyle w:val="Heading1"/>
       </w:pPr>
       <w:r>
-        <w:t>7. Sources</w:t>
+        <w:t>8. Sources</w:t>
       </w:r>
     </w:p>
     <w:p>
@@ -1420,7 +1429,7 @@
         <w:rPr>
           <w:b w:val="0"/>
         </w:rPr>
-        <w:t>REAC Manager d'établissement marchand, TP-00136, millésime 09 du 10/12/2025 (document transmis).</w:t>
+        <w:t>Certificat Qualiopi n° 25FOR02027.1, Qualitia, émis le 17/02/2026 (document transmis).</w:t>
       </w:r>
     </w:p>
     <w:p>
@@ -1431,7 +1440,7 @@
         <w:rPr>
           <w:b w:val="0"/>
         </w:rPr>
-        <w:t>Référentiel d'évaluation Manager d'établissement marchand, millésime 09 du 10/12/2025 (document transmis).</w:t>
+        <w:t>Base Airtable « YEBA FORMATIONS — Centre de formation (Adaptable) » : tables CONFIG SYSTÈME, DOCUMENTS OFFICIELS YEBA, FORMATEURS &amp; PRESTATAIRES, consultées le 22/10/2026.</w:t>
       </w:r>
     </w:p>
     <w:p>
@@ -1442,7 +1451,7 @@
         <w:rPr>
           <w:b w:val="0"/>
         </w:rPr>
-        <w:t>Fiches France Compétences RNCP41853 et RNCP38575 (documents transmis, consultés le 21/10/2026).</w:t>
+        <w:t>REAC et référentiel d'évaluation Manager d'établissement marchand, millésime 09 du 10/12/2025 (documents transmis).</w:t>
       </w:r>
     </w:p>
     <w:p>
@@ -1453,7 +1462,7 @@
         <w:rPr>
           <w:b w:val="0"/>
         </w:rPr>
-        <w:t>REAC et RC Responsable de petite et moyenne structure, RNCP35646, millésime 07 de 2016 (documents transmis — version remplacée).</w:t>
+        <w:t>Fiches France Compétences RNCP41853 et RNCP38575 (documents transmis).</w:t>
       </w:r>
     </w:p>
     <w:p>
@@ -1464,7 +1473,7 @@
         <w:rPr>
           <w:b w:val="0"/>
         </w:rPr>
-        <w:t>Période en entreprise RPMS de 210 h : référentiel d'évaluation RPMS v08 cité par plusieurs organismes (medef.nc, icademie.com, etudis.net).</w:t>
+        <w:t>REAC et RC RPMS RNCP35646, millésime 07 de 2016 (documents transmis, version remplacée).</w:t>
       </w:r>
     </w:p>
     <w:p>
@@ -1475,18 +1484,7 @@
         <w:rPr>
           <w:b w:val="0"/>
         </w:rPr>
-        <w:t>Agrément des sessions : démarche « DEETS 974 — demande d'agrément pour organiser des sessions » (demarche.numerique.gouv.fr).</w:t>
-      </w:r>
-    </w:p>
-    <w:p>
-      <w:pPr>
-        <w:pStyle w:val="ListBullet"/>
-      </w:pPr>
-      <w:r>
-        <w:rPr>
-          <w:b w:val="0"/>
-        </w:rPr>
-        <w:t>Code du travail ; RGPD (règlement UE 2016/679) ; IA Act (règlement UE 2024/1689).</w:t>
+        <w:t>Code du travail ; code général des impôts, art. 293 B et 261-4-4° a ; RGPD ; règlement (UE) 2024/1689.</w:t>
       </w:r>
     </w:p>
     <w:tbl>
@@ -1522,7 +1520,7 @@
                 <w:b w:val="0"/>
                 <w:sz w:val="22"/>
               </w:rPr>
-              <w:t>RGPD : tous les modèles contiennent une information des personnes et respectent la minimisation ; registre et durées de conservation dans 04_RGPD_IA_Act.</w:t>
+              <w:t>RGPD : chaque modèle informe les personnes et limite les données ; le complément RGPD-01 est à reporter dans le registre YEBA-DOC-16.</w:t>
             </w:r>
           </w:p>
           <w:p>
@@ -1531,13 +1529,131 @@
                 <w:b w:val="0"/>
                 <w:sz w:val="22"/>
               </w:rPr>
-              <w:t>IA Act : aucun usage d'IA pour admettre, évaluer ou surveiller les stagiaires (annexe III, haut risque) ; formation de l'équipe à la maîtrise de l'IA (article 4).</w:t>
+              <w:t>IA Act : aucun système d'IA n'évalue, ne note, ne classe ni ne sélectionne les stagiaires ; maîtrise de l'IA assurée par la charte YEBA-DOC-11.</w:t>
             </w:r>
           </w:p>
         </w:tc>
       </w:tr>
     </w:tbl>
     <w:p/>
+    <w:p>
+      <w:pPr>
+        <w:pBdr>
+          <w:bottom w:val="single" w:sz="18" w:space="1" w:color="C9A84C"/>
+        </w:pBdr>
+      </w:pPr>
+    </w:p>
+    <w:p>
+      <w:pPr>
+        <w:keepNext/>
+        <w:spacing w:after="0"/>
+      </w:pPr>
+      <w:r>
+        <w:rPr>
+          <w:b/>
+          <w:color w:val="1B3A6B"/>
+          <w:sz w:val="20"/>
+        </w:rPr>
+        <w:t>YEBA FORMATIONS — Aurélien LUMEKA, entrepreneur individuel (EI), directeur</w:t>
+      </w:r>
+    </w:p>
+    <w:p>
+      <w:pPr>
+        <w:keepNext/>
+        <w:spacing w:after="0"/>
+      </w:pPr>
+      <w:r>
+        <w:rPr>
+          <w:b w:val="0"/>
+          <w:color w:val="121212"/>
+          <w:sz w:val="20"/>
+        </w:rPr>
+        <w:t>9 rue Françoise Châtelain, 97490 Sainte-Clotilde, La Réunion</w:t>
+      </w:r>
+    </w:p>
+    <w:p>
+      <w:pPr>
+        <w:keepNext/>
+        <w:spacing w:after="0"/>
+      </w:pPr>
+      <w:r>
+        <w:rPr>
+          <w:b w:val="0"/>
+          <w:color w:val="121212"/>
+          <w:sz w:val="20"/>
+        </w:rPr>
+        <w:t>Tél. 0693 32 24 45 — yebaformations@gmail.com</w:t>
+      </w:r>
+    </w:p>
+    <w:p>
+      <w:pPr>
+        <w:keepNext/>
+        <w:spacing w:after="0"/>
+      </w:pPr>
+      <w:r>
+        <w:rPr>
+          <w:b w:val="0"/>
+          <w:color w:val="121212"/>
+          <w:sz w:val="20"/>
+        </w:rPr>
+        <w:t>SIRET 814 622 262 00032</w:t>
+      </w:r>
+    </w:p>
+    <w:p>
+      <w:pPr>
+        <w:keepNext/>
+        <w:spacing w:after="0"/>
+      </w:pPr>
+      <w:r>
+        <w:rPr>
+          <w:b w:val="0"/>
+          <w:color w:val="121212"/>
+          <w:sz w:val="20"/>
+        </w:rPr>
+        <w:t>Déclaration d'activité n° 04973676397 auprès du Préfet de La Réunion. Cet enregistrement ne vaut pas agrément de l'État.</w:t>
+      </w:r>
+    </w:p>
+    <w:p>
+      <w:pPr>
+        <w:keepNext/>
+        <w:spacing w:after="0"/>
+      </w:pPr>
+      <w:r>
+        <w:rPr>
+          <w:b w:val="0"/>
+          <w:color w:val="121212"/>
+          <w:sz w:val="20"/>
+        </w:rPr>
+        <w:t>Certification Qualiopi n° 25FOR02027.1 délivrée au titre des catégories : actions de formation, bilans de compétences, actions permettant de faire valider les acquis de l'expérience, actions de formation par apprentissage — organisme certificateur Qualitia (accrédité COFRAC).</w:t>
+      </w:r>
+    </w:p>
+    <w:p>
+      <w:pPr>
+        <w:keepNext/>
+        <w:spacing w:after="0"/>
+      </w:pPr>
+      <w:r>
+        <w:rPr>
+          <w:b w:val="0"/>
+          <w:color w:val="121212"/>
+          <w:sz w:val="20"/>
+        </w:rPr>
+        <w:t>Référent handicap : Aurélien LUMEKA — yebaformations@gmail.com. Document disponible en 16 points sur simple demande.</w:t>
+      </w:r>
+    </w:p>
+    <w:p>
+      <w:pPr>
+        <w:spacing w:before="120"/>
+      </w:pPr>
+      <w:r>
+        <w:rPr>
+          <w:b w:val="0"/>
+          <w:color w:val="5A5F6A"/>
+          <w:sz w:val="18"/>
+        </w:rPr>
+        <w:t>Ce document a été conçu par le formateur avec l'assistance d'un système d'IA générative (règlement (UE) 2024/1689, art. 50). Son contenu a été vérifié et validé par un humain, qui en assume la responsabilité.</w:t>
+      </w:r>
+    </w:p>
     <w:sectPr>
       <w:headerReference w:type="default" r:id="rId9"/>
       <w:footerReference w:type="default" r:id="rId10"/>
@@ -1562,7 +1678,7 @@
         <w:color w:val="1B3A6B"/>
         <w:sz w:val="18"/>
       </w:rPr>
-      <w:t xml:space="preserve">NOTE-00   |   YEBA FORMATIONS — SIRET 814 622 262 00032 — Version 2026-10-v2   |   Page </w:t>
+      <w:t xml:space="preserve">NOTE-00   |   YEBA FORMATIONS — SIRET 814 622 262 00032 — Version 2026-10-v3   |   Page </w:t>
     </w:r>
     <w:r>
       <w:rPr>
@@ -1993,10 +2109,11 @@
     <w:qFormat/>
     <w:rsid w:val="00FC693F"/>
     <w:pPr>
-      <w:spacing w:after="120" w:line="276" w:lineRule="auto"/>
+      <w:spacing w:after="120" w:line="312" w:lineRule="auto"/>
     </w:pPr>
     <w:rPr>
       <w:rFonts w:ascii="Arial" w:hAnsi="Arial" w:eastAsia="Arial"/>
+      <w:color w:val="121212"/>
       <w:sz w:val="24"/>
     </w:rPr>
   </w:style>
@@ -2110,7 +2227,7 @@
       <w:rFonts w:asciiTheme="majorHAnsi" w:eastAsiaTheme="majorEastAsia" w:hAnsiTheme="majorHAnsi" w:cstheme="majorBidi" w:ascii="Arial" w:hAnsi="Arial"/>
       <w:b/>
       <w:bCs/>
-      <w:color w:val="8A6D1F"/>
+      <w:color w:val="1B3A6B"/>
       <w:sz w:val="28"/>
     </w:rPr>
   </w:style>

</xml_diff>

<commit_message>
Livrets d'accueil MEM et RPMS, fiche lieu, étude tarifaire et déclinaisons du logo
- Livrets d'accueil au format du livret Marilyn (HTML imprimé par Chromium) :
  A5 lecture écran et A4 paysage imposé en livret plié, sommaire paginé,
  année en un coup d'œil, calendrier mensuel, accès en bus, restauration,
  règlement intérieur YEBA-DOC-04 et avenant.
- LIEU-01 : fiche « Votre lieu de formation » (Secrétariat Center, Technor).
- TAR-01 : concurrents, plafonds des financeurs, trois scénarios par titre ;
  feuille « Scénarios tarifaires » dans le classeur.
- Logo PNG décliné : fond clair (FORMATIONS en bleu), fond bleu, carrés,
  icônes ; polices Montserrat et Inter embarquées.
- Effectif de 10 stagiaires par promotion.

Co-Authored-By: Claude Opus 5.5 <noreply@anthropic.com>
Claude-Session: https://claude.ai/code/session_01JZ6CWNerPeDJEuR1MPsUp5
</commit_message>
<xml_diff>
--- a/dossier-conformite-2026/livrables/00_NOTE_DE_SYNTHESE.docx
+++ b/dossier-conformite-2026/livrables/00_NOTE_DE_SYNTHESE.docx
@@ -10,7 +10,7 @@
       <w:r>
         <w:drawing>
           <wp:inline xmlns:a="http://schemas.openxmlformats.org/drawingml/2006/main" xmlns:pic="http://schemas.openxmlformats.org/drawingml/2006/picture">
-            <wp:extent cx="3805369" cy="3240000"/>
+            <wp:extent cx="3745665" cy="3240000"/>
             <wp:docPr id="1" name="Picture 1"/>
             <wp:cNvGraphicFramePr>
               <a:graphicFrameLocks noChangeAspect="1"/>
@@ -19,7 +19,7 @@
               <a:graphicData uri="http://schemas.openxmlformats.org/drawingml/2006/picture">
                 <pic:pic>
                   <pic:nvPicPr>
-                    <pic:cNvPr id="0" name="logo_yeba_formations.png"/>
+                    <pic:cNvPr id="0" name="logo_yeba_fond_clair_1000.png"/>
                     <pic:cNvPicPr/>
                   </pic:nvPicPr>
                   <pic:blipFill>
@@ -31,7 +31,7 @@
                   <pic:spPr>
                     <a:xfrm>
                       <a:off x="0" y="0"/>
-                      <a:ext cx="3805369" cy="3240000"/>
+                      <a:ext cx="3745665" cy="3240000"/>
                     </a:xfrm>
                     <a:prstGeom prst="rect"/>
                   </pic:spPr>
@@ -86,7 +86,7 @@
           <w:color w:val="1B3A6B"/>
           <w:sz w:val="24"/>
         </w:rPr>
-        <w:t>Secrétariat Center — 7 rue Henri Cornu — 97490 Saint-Denis</w:t>
+        <w:t>Secrétariat Center — Immeuble Rodrigues 2 — 7 rue Henri Cornu — Parc Technor — 97490 Saint-Denis</w:t>
       </w:r>
     </w:p>
     <w:p>
@@ -675,7 +675,7 @@
                 <w:b w:val="0"/>
                 <w:sz w:val="22"/>
               </w:rPr>
-              <w:t>Secrétariat Center : entrée accessible aux personnes à mobilité réduite, sanitaires, salle de pause, vidéoprojecteur et tableau</w:t>
+              <w:t>Secrétariat Center : entrée, parking, sièges et toilettes accessibles en fauteuil roulant, salle de pause, vidéoprojecteur et tableau</w:t>
             </w:r>
           </w:p>
         </w:tc>
@@ -1242,7 +1242,7 @@
                 <w:b w:val="0"/>
                 <w:sz w:val="22"/>
               </w:rPr>
-              <w:t>Deux logos possibles (PNG transmis, SVG de la charte)</w:t>
+              <w:t>Deux logos coexistaient (PNG transmis, SVG de la charte)</w:t>
             </w:r>
           </w:p>
         </w:tc>
@@ -1258,7 +1258,7 @@
                 <w:b w:val="0"/>
                 <w:sz w:val="22"/>
               </w:rPr>
-              <w:t>PNG utilisé ; à confirmer</w:t>
+              <w:t>PNG retenu et décliné : fond clair (FORMATIONS en bleu), fond bleu, carré réseaux sociaux, icône</w:t>
             </w:r>
           </w:p>
         </w:tc>
@@ -1356,7 +1356,7 @@
         <w:rPr>
           <w:b w:val="0"/>
         </w:rPr>
-        <w:t>Le prix de vente par titre et par CCP, et l'effectif cible par promotion.</w:t>
+        <w:t>Votre décision sur les prix : trois scénarios dans l'étude TAR-01 (recommandation : 4 900 € MEM, 4 950 € RPMS).</w:t>
       </w:r>
     </w:p>
     <w:p>
@@ -1374,7 +1374,7 @@
         <w:rPr>
           <w:b w:val="0"/>
         </w:rPr>
-        <w:t>Le logo officiel : le PNG transmis ou le fichier « logo-yeba-sans-oeil.svg » de votre charte ?</w:t>
+        <w:t>Le seuil de maintien d'une session (nombre minimal de stagiaires) une fois le prix choisi.</w:t>
       </w:r>
     </w:p>
     <w:p>
@@ -1392,7 +1392,7 @@
         <w:rPr>
           <w:b w:val="0"/>
         </w:rPr>
-        <w:t>Les accès au Secrétariat Center (lignes de bus, stationnement).</w:t>
+        <w:t>Votre vérification sur place des lignes de bus, des temps de marche et des prix des restaurants (fiche LIEU-01).</w:t>
       </w:r>
     </w:p>
     <w:p>
@@ -1702,7 +1702,7 @@
     <w:r>
       <w:drawing>
         <wp:inline xmlns:a="http://schemas.openxmlformats.org/drawingml/2006/main" xmlns:pic="http://schemas.openxmlformats.org/drawingml/2006/picture">
-          <wp:extent cx="634228" cy="540000"/>
+          <wp:extent cx="624277" cy="540000"/>
           <wp:docPr id="1" name="Picture 1"/>
           <wp:cNvGraphicFramePr>
             <a:graphicFrameLocks noChangeAspect="1"/>
@@ -1711,7 +1711,7 @@
             <a:graphicData uri="http://schemas.openxmlformats.org/drawingml/2006/picture">
               <pic:pic>
                 <pic:nvPicPr>
-                  <pic:cNvPr id="0" name="logo_yeba_formations.png"/>
+                  <pic:cNvPr id="0" name="logo_yeba_fond_clair_1000.png"/>
                   <pic:cNvPicPr/>
                 </pic:nvPicPr>
                 <pic:blipFill>
@@ -1723,7 +1723,7 @@
                 <pic:spPr>
                   <a:xfrm>
                     <a:off x="0" y="0"/>
-                    <a:ext cx="634228" cy="540000"/>
+                    <a:ext cx="624277" cy="540000"/>
                   </a:xfrm>
                   <a:prstGeom prst="rect"/>
                 </pic:spPr>

</xml_diff>